<commit_message>
fix(ui): adapt serial number input color to current theme
The serial number input field now correctly uses theme-appropriate
colors for valid serial numbers not found in the report. Previously,
the color was hardcoded to white, making text invisible in light theme.

Changes:
- Add _get_serial_number_text_color() to determine text color based on theme
- Add _update_serial_number_color_for_theme() to update colors on theme change
- Update color assignments to use dynamic theme-based colors
- Update version to 1.7.3rc
</commit_message>
<xml_diff>
--- a/doc/КРАТКАЯ_ИНСТРУКЦИЯ_EXE.docx
+++ b/doc/КРАТКАЯ_ИНСТРУКЦИЯ_EXE.docx
@@ -614,6 +614,67 @@
         <w:t xml:space="preserve">— однократное измерение</w:t>
       </w:r>
     </w:p>
+    <w:p>
+      <w:pPr>
+        <w:pStyle w:val="Compact"/>
+        <w:numPr>
+          <w:ilvl w:val="0"/>
+          <w:numId w:val="1010"/>
+        </w:numPr>
+      </w:pPr>
+      <w:r>
+        <w:rPr>
+          <w:b/>
+          <w:bCs/>
+        </w:rPr>
+        <w:t xml:space="preserve">Дополнительные кнопки</w:t>
+      </w:r>
+      <w:r>
+        <w:t xml:space="preserve">:</w:t>
+      </w:r>
+    </w:p>
+    <w:p>
+      <w:pPr>
+        <w:pStyle w:val="Compact"/>
+        <w:numPr>
+          <w:ilvl w:val="1"/>
+          <w:numId w:val="1013"/>
+        </w:numPr>
+      </w:pPr>
+      <w:r>
+        <w:rPr>
+          <w:rStyle w:val="VerbatimChar"/>
+        </w:rPr>
+        <w:t xml:space="preserve">☯</w:t>
+      </w:r>
+      <w:r>
+        <w:t xml:space="preserve"> </w:t>
+      </w:r>
+      <w:r>
+        <w:t xml:space="preserve">(инь-янь) — переключение темы оформления (светлая/тёмная)</w:t>
+      </w:r>
+    </w:p>
+    <w:p>
+      <w:pPr>
+        <w:pStyle w:val="Compact"/>
+        <w:numPr>
+          <w:ilvl w:val="1"/>
+          <w:numId w:val="1013"/>
+        </w:numPr>
+      </w:pPr>
+      <w:r>
+        <w:rPr>
+          <w:rStyle w:val="VerbatimChar"/>
+        </w:rPr>
+        <w:t xml:space="preserve">i</w:t>
+      </w:r>
+      <w:r>
+        <w:t xml:space="preserve"> </w:t>
+      </w:r>
+      <w:r>
+        <w:t xml:space="preserve">(на синем фоне) — открытие окна логов программы</w:t>
+      </w:r>
+    </w:p>
     <w:bookmarkEnd w:id="15"/>
     <w:bookmarkEnd w:id="16"/>
     <w:bookmarkStart w:id="17" w:name="состояния-каналов"/>
@@ -630,7 +691,7 @@
         <w:pStyle w:val="Compact"/>
         <w:numPr>
           <w:ilvl w:val="0"/>
-          <w:numId w:val="1013"/>
+          <w:numId w:val="1014"/>
         </w:numPr>
       </w:pPr>
       <w:r>
@@ -652,7 +713,7 @@
         <w:pStyle w:val="Compact"/>
         <w:numPr>
           <w:ilvl w:val="0"/>
-          <w:numId w:val="1013"/>
+          <w:numId w:val="1014"/>
         </w:numPr>
       </w:pPr>
       <w:r>
@@ -1692,7 +1753,7 @@
         <w:pStyle w:val="Compact"/>
         <w:numPr>
           <w:ilvl w:val="0"/>
-          <w:numId w:val="1014"/>
+          <w:numId w:val="1015"/>
         </w:numPr>
       </w:pPr>
       <w:r>
@@ -1704,7 +1765,7 @@
         <w:pStyle w:val="Compact"/>
         <w:numPr>
           <w:ilvl w:val="0"/>
-          <w:numId w:val="1014"/>
+          <w:numId w:val="1015"/>
         </w:numPr>
       </w:pPr>
       <w:r>
@@ -1726,7 +1787,7 @@
         <w:pStyle w:val="Compact"/>
         <w:numPr>
           <w:ilvl w:val="0"/>
-          <w:numId w:val="1014"/>
+          <w:numId w:val="1015"/>
         </w:numPr>
       </w:pPr>
       <w:r>
@@ -1748,7 +1809,7 @@
         <w:pStyle w:val="Compact"/>
         <w:numPr>
           <w:ilvl w:val="0"/>
-          <w:numId w:val="1014"/>
+          <w:numId w:val="1015"/>
         </w:numPr>
       </w:pPr>
       <w:r>
@@ -1780,7 +1841,7 @@
         <w:pStyle w:val="Compact"/>
         <w:numPr>
           <w:ilvl w:val="0"/>
-          <w:numId w:val="1015"/>
+          <w:numId w:val="1016"/>
         </w:numPr>
       </w:pPr>
       <w:r>
@@ -1792,7 +1853,7 @@
         <w:pStyle w:val="Compact"/>
         <w:numPr>
           <w:ilvl w:val="0"/>
-          <w:numId w:val="1015"/>
+          <w:numId w:val="1016"/>
         </w:numPr>
       </w:pPr>
       <w:r>
@@ -1804,7 +1865,7 @@
         <w:pStyle w:val="Compact"/>
         <w:numPr>
           <w:ilvl w:val="0"/>
-          <w:numId w:val="1015"/>
+          <w:numId w:val="1016"/>
         </w:numPr>
       </w:pPr>
       <w:r>
@@ -1841,7 +1902,7 @@
         <w:pStyle w:val="Compact"/>
         <w:numPr>
           <w:ilvl w:val="0"/>
-          <w:numId w:val="1016"/>
+          <w:numId w:val="1017"/>
         </w:numPr>
       </w:pPr>
       <w:r>
@@ -1868,7 +1929,7 @@
         <w:pStyle w:val="Compact"/>
         <w:numPr>
           <w:ilvl w:val="0"/>
-          <w:numId w:val="1016"/>
+          <w:numId w:val="1017"/>
         </w:numPr>
       </w:pPr>
       <w:r>
@@ -1889,7 +1950,7 @@
         <w:pStyle w:val="Compact"/>
         <w:numPr>
           <w:ilvl w:val="0"/>
-          <w:numId w:val="1016"/>
+          <w:numId w:val="1017"/>
         </w:numPr>
       </w:pPr>
       <w:r>
@@ -1921,7 +1982,7 @@
         <w:pStyle w:val="Compact"/>
         <w:numPr>
           <w:ilvl w:val="0"/>
-          <w:numId w:val="1017"/>
+          <w:numId w:val="1018"/>
         </w:numPr>
       </w:pPr>
       <w:r>
@@ -1933,7 +1994,7 @@
         <w:pStyle w:val="Compact"/>
         <w:numPr>
           <w:ilvl w:val="0"/>
-          <w:numId w:val="1017"/>
+          <w:numId w:val="1018"/>
         </w:numPr>
       </w:pPr>
       <w:r>
@@ -1945,7 +2006,7 @@
         <w:pStyle w:val="Compact"/>
         <w:numPr>
           <w:ilvl w:val="0"/>
-          <w:numId w:val="1017"/>
+          <w:numId w:val="1018"/>
         </w:numPr>
       </w:pPr>
       <w:r>
@@ -1976,7 +2037,7 @@
         <w:pStyle w:val="Compact"/>
         <w:numPr>
           <w:ilvl w:val="0"/>
-          <w:numId w:val="1018"/>
+          <w:numId w:val="1019"/>
         </w:numPr>
       </w:pPr>
       <w:r>
@@ -1988,7 +2049,7 @@
         <w:pStyle w:val="Compact"/>
         <w:numPr>
           <w:ilvl w:val="0"/>
-          <w:numId w:val="1018"/>
+          <w:numId w:val="1019"/>
         </w:numPr>
       </w:pPr>
       <w:r>
@@ -2009,7 +2070,7 @@
         <w:pStyle w:val="Compact"/>
         <w:numPr>
           <w:ilvl w:val="0"/>
-          <w:numId w:val="1018"/>
+          <w:numId w:val="1019"/>
         </w:numPr>
       </w:pPr>
       <w:r>
@@ -2021,7 +2082,7 @@
         <w:pStyle w:val="Compact"/>
         <w:numPr>
           <w:ilvl w:val="0"/>
-          <w:numId w:val="1018"/>
+          <w:numId w:val="1019"/>
         </w:numPr>
       </w:pPr>
       <w:r>
@@ -2201,7 +2262,7 @@
         <w:pStyle w:val="Compact"/>
         <w:numPr>
           <w:ilvl w:val="0"/>
-          <w:numId w:val="1019"/>
+          <w:numId w:val="1020"/>
         </w:numPr>
       </w:pPr>
       <w:r>
@@ -2213,7 +2274,7 @@
         <w:pStyle w:val="Compact"/>
         <w:numPr>
           <w:ilvl w:val="0"/>
-          <w:numId w:val="1019"/>
+          <w:numId w:val="1020"/>
         </w:numPr>
       </w:pPr>
       <w:r>
@@ -2225,7 +2286,7 @@
         <w:pStyle w:val="Compact"/>
         <w:numPr>
           <w:ilvl w:val="0"/>
-          <w:numId w:val="1019"/>
+          <w:numId w:val="1020"/>
         </w:numPr>
       </w:pPr>
       <w:r>
@@ -2246,7 +2307,7 @@
         <w:pStyle w:val="Compact"/>
         <w:numPr>
           <w:ilvl w:val="0"/>
-          <w:numId w:val="1019"/>
+          <w:numId w:val="1020"/>
         </w:numPr>
       </w:pPr>
       <w:r>
@@ -2258,7 +2319,7 @@
         <w:pStyle w:val="Compact"/>
         <w:numPr>
           <w:ilvl w:val="0"/>
-          <w:numId w:val="1019"/>
+          <w:numId w:val="1020"/>
         </w:numPr>
       </w:pPr>
       <w:r>
@@ -2289,7 +2350,7 @@
         <w:pStyle w:val="Compact"/>
         <w:numPr>
           <w:ilvl w:val="0"/>
-          <w:numId w:val="1020"/>
+          <w:numId w:val="1021"/>
         </w:numPr>
       </w:pPr>
       <w:r>
@@ -2316,7 +2377,7 @@
         <w:pStyle w:val="Compact"/>
         <w:numPr>
           <w:ilvl w:val="0"/>
-          <w:numId w:val="1020"/>
+          <w:numId w:val="1021"/>
         </w:numPr>
       </w:pPr>
       <w:r>
@@ -2328,7 +2389,7 @@
         <w:pStyle w:val="Compact"/>
         <w:numPr>
           <w:ilvl w:val="0"/>
-          <w:numId w:val="1020"/>
+          <w:numId w:val="1021"/>
         </w:numPr>
       </w:pPr>
       <w:r>
@@ -2340,7 +2401,7 @@
         <w:pStyle w:val="Compact"/>
         <w:numPr>
           <w:ilvl w:val="0"/>
-          <w:numId w:val="1020"/>
+          <w:numId w:val="1021"/>
         </w:numPr>
       </w:pPr>
       <w:r>
@@ -2386,7 +2447,7 @@
         <w:pStyle w:val="Compact"/>
         <w:numPr>
           <w:ilvl w:val="0"/>
-          <w:numId w:val="1021"/>
+          <w:numId w:val="1022"/>
         </w:numPr>
       </w:pPr>
       <w:r>
@@ -2398,7 +2459,7 @@
         <w:pStyle w:val="Compact"/>
         <w:numPr>
           <w:ilvl w:val="0"/>
-          <w:numId w:val="1021"/>
+          <w:numId w:val="1022"/>
         </w:numPr>
       </w:pPr>
       <w:r>
@@ -2410,7 +2471,7 @@
         <w:pStyle w:val="Compact"/>
         <w:numPr>
           <w:ilvl w:val="0"/>
-          <w:numId w:val="1021"/>
+          <w:numId w:val="1022"/>
         </w:numPr>
       </w:pPr>
       <w:r>
@@ -2422,7 +2483,7 @@
         <w:pStyle w:val="Compact"/>
         <w:numPr>
           <w:ilvl w:val="0"/>
-          <w:numId w:val="1021"/>
+          <w:numId w:val="1022"/>
         </w:numPr>
       </w:pPr>
       <w:r>
@@ -2444,7 +2505,7 @@
         <w:pStyle w:val="Compact"/>
         <w:numPr>
           <w:ilvl w:val="0"/>
-          <w:numId w:val="1022"/>
+          <w:numId w:val="1023"/>
         </w:numPr>
       </w:pPr>
       <w:r>
@@ -2456,7 +2517,7 @@
         <w:pStyle w:val="Compact"/>
         <w:numPr>
           <w:ilvl w:val="0"/>
-          <w:numId w:val="1022"/>
+          <w:numId w:val="1023"/>
         </w:numPr>
       </w:pPr>
       <w:r>
@@ -2468,7 +2529,7 @@
         <w:pStyle w:val="Compact"/>
         <w:numPr>
           <w:ilvl w:val="0"/>
-          <w:numId w:val="1022"/>
+          <w:numId w:val="1023"/>
         </w:numPr>
       </w:pPr>
       <w:r>
@@ -2480,7 +2541,7 @@
         <w:pStyle w:val="Compact"/>
         <w:numPr>
           <w:ilvl w:val="0"/>
-          <w:numId w:val="1022"/>
+          <w:numId w:val="1023"/>
         </w:numPr>
       </w:pPr>
       <w:r>
@@ -2502,7 +2563,7 @@
         <w:pStyle w:val="Compact"/>
         <w:numPr>
           <w:ilvl w:val="0"/>
-          <w:numId w:val="1023"/>
+          <w:numId w:val="1024"/>
         </w:numPr>
       </w:pPr>
       <w:r>
@@ -2514,7 +2575,7 @@
         <w:pStyle w:val="Compact"/>
         <w:numPr>
           <w:ilvl w:val="0"/>
-          <w:numId w:val="1023"/>
+          <w:numId w:val="1024"/>
         </w:numPr>
       </w:pPr>
       <w:r>
@@ -2526,7 +2587,7 @@
         <w:pStyle w:val="Compact"/>
         <w:numPr>
           <w:ilvl w:val="0"/>
-          <w:numId w:val="1023"/>
+          <w:numId w:val="1024"/>
         </w:numPr>
       </w:pPr>
       <w:r>
@@ -2548,7 +2609,7 @@
         <w:pStyle w:val="Compact"/>
         <w:numPr>
           <w:ilvl w:val="0"/>
-          <w:numId w:val="1024"/>
+          <w:numId w:val="1025"/>
         </w:numPr>
       </w:pPr>
       <w:r>
@@ -2560,7 +2621,7 @@
         <w:pStyle w:val="Compact"/>
         <w:numPr>
           <w:ilvl w:val="0"/>
-          <w:numId w:val="1024"/>
+          <w:numId w:val="1025"/>
         </w:numPr>
       </w:pPr>
       <w:r>
@@ -2583,7 +2644,7 @@
         <w:pStyle w:val="Compact"/>
         <w:numPr>
           <w:ilvl w:val="0"/>
-          <w:numId w:val="1025"/>
+          <w:numId w:val="1026"/>
         </w:numPr>
       </w:pPr>
       <w:r>
@@ -2605,7 +2666,7 @@
         <w:pStyle w:val="Compact"/>
         <w:numPr>
           <w:ilvl w:val="0"/>
-          <w:numId w:val="1025"/>
+          <w:numId w:val="1026"/>
         </w:numPr>
       </w:pPr>
       <w:r>
@@ -2617,7 +2678,7 @@
         <w:pStyle w:val="Compact"/>
         <w:numPr>
           <w:ilvl w:val="0"/>
-          <w:numId w:val="1025"/>
+          <w:numId w:val="1026"/>
         </w:numPr>
       </w:pPr>
       <w:r>
@@ -2629,7 +2690,7 @@
         <w:pStyle w:val="Compact"/>
         <w:numPr>
           <w:ilvl w:val="0"/>
-          <w:numId w:val="1025"/>
+          <w:numId w:val="1026"/>
         </w:numPr>
       </w:pPr>
       <w:r>
@@ -3071,34 +3132,7 @@
     <w:abstractNumId w:val="991"/>
   </w:num>
   <w:num w:numId="1015">
-    <w:abstractNumId w:val="99411"/>
-    <w:lvlOverride w:ilvl="0">
-      <w:startOverride w:val="1"/>
-    </w:lvlOverride>
-    <w:lvlOverride w:ilvl="1">
-      <w:startOverride w:val="1"/>
-    </w:lvlOverride>
-    <w:lvlOverride w:ilvl="2">
-      <w:startOverride w:val="1"/>
-    </w:lvlOverride>
-    <w:lvlOverride w:ilvl="3">
-      <w:startOverride w:val="1"/>
-    </w:lvlOverride>
-    <w:lvlOverride w:ilvl="4">
-      <w:startOverride w:val="1"/>
-    </w:lvlOverride>
-    <w:lvlOverride w:ilvl="5">
-      <w:startOverride w:val="1"/>
-    </w:lvlOverride>
-    <w:lvlOverride w:ilvl="6">
-      <w:startOverride w:val="1"/>
-    </w:lvlOverride>
-    <w:lvlOverride w:ilvl="7">
-      <w:startOverride w:val="1"/>
-    </w:lvlOverride>
-    <w:lvlOverride w:ilvl="8">
-      <w:startOverride w:val="1"/>
-    </w:lvlOverride>
+    <w:abstractNumId w:val="991"/>
   </w:num>
   <w:num w:numId="1016">
     <w:abstractNumId w:val="99411"/>
@@ -3371,6 +3405,36 @@
     </w:lvlOverride>
   </w:num>
   <w:num w:numId="1025">
+    <w:abstractNumId w:val="99411"/>
+    <w:lvlOverride w:ilvl="0">
+      <w:startOverride w:val="1"/>
+    </w:lvlOverride>
+    <w:lvlOverride w:ilvl="1">
+      <w:startOverride w:val="1"/>
+    </w:lvlOverride>
+    <w:lvlOverride w:ilvl="2">
+      <w:startOverride w:val="1"/>
+    </w:lvlOverride>
+    <w:lvlOverride w:ilvl="3">
+      <w:startOverride w:val="1"/>
+    </w:lvlOverride>
+    <w:lvlOverride w:ilvl="4">
+      <w:startOverride w:val="1"/>
+    </w:lvlOverride>
+    <w:lvlOverride w:ilvl="5">
+      <w:startOverride w:val="1"/>
+    </w:lvlOverride>
+    <w:lvlOverride w:ilvl="6">
+      <w:startOverride w:val="1"/>
+    </w:lvlOverride>
+    <w:lvlOverride w:ilvl="7">
+      <w:startOverride w:val="1"/>
+    </w:lvlOverride>
+    <w:lvlOverride w:ilvl="8">
+      <w:startOverride w:val="1"/>
+    </w:lvlOverride>
+  </w:num>
+  <w:num w:numId="1026">
     <w:abstractNumId w:val="991"/>
   </w:num>
 </w:numbering>

</xml_diff>

<commit_message>
docs(examples): remove SLOW speed tip for 200mV range
</commit_message>
<xml_diff>
--- a/doc/КРАТКАЯ_ИНСТРУКЦИЯ_EXE.docx
+++ b/doc/КРАТКАЯ_ИНСТРУКЦИЯ_EXE.docx
@@ -2716,7 +2716,7 @@
         <w:t xml:space="preserve">Версия программы</w:t>
       </w:r>
       <w:r>
-        <w:t xml:space="preserve">: 1.7.2rc</w:t>
+        <w:t xml:space="preserve">: 1.7.3rc</w:t>
       </w:r>
       <w:r>
         <w:br/>
@@ -2729,7 +2729,7 @@
         <w:t xml:space="preserve">Дата</w:t>
       </w:r>
       <w:r>
-        <w:t xml:space="preserve">: 02.02.2026</w:t>
+        <w:t xml:space="preserve">: 03.02.2026</w:t>
       </w:r>
     </w:p>
     <w:bookmarkEnd w:id="40"/>

</xml_diff>

<commit_message>
docs: update brief instructions for EXE module in Russian
</commit_message>
<xml_diff>
--- a/doc/КРАТКАЯ_ИНСТРУКЦИЯ_EXE.docx
+++ b/doc/КРАТКАЯ_ИНСТРУКЦИЯ_EXE.docx
@@ -2,7 +2,7 @@
 <file path=word/document.xml><?xml version="1.0" encoding="utf-8"?>
 <w:document xmlns:w="http://schemas.openxmlformats.org/wordprocessingml/2006/main" xmlns:m="http://schemas.openxmlformats.org/officeDocument/2006/math" xmlns:r="http://schemas.openxmlformats.org/officeDocument/2006/relationships" xmlns:o="urn:schemas-microsoft-com:office:office" xmlns:v="urn:schemas-microsoft-com:vml" xmlns:w10="urn:schemas-microsoft-com:office:word" xmlns:a="http://schemas.openxmlformats.org/drawingml/2006/main" xmlns:pic="http://schemas.openxmlformats.org/drawingml/2006/picture" xmlns:wp="http://schemas.openxmlformats.org/drawingml/2006/wordprocessingDrawing">
   <w:body>
-    <w:bookmarkStart w:id="41" w:name="X8257d0e2aa95289dfddf044b5c1c1d608cb04f4"/>
+    <w:bookmarkStart w:id="42" w:name="X8257d0e2aa95289dfddf044b5c1c1d608cb04f4"/>
     <w:p>
       <w:pPr>
         <w:pStyle w:val="Heading1"/>
@@ -2424,22 +2424,21 @@
       </w:r>
     </w:p>
     <w:bookmarkEnd w:id="34"/>
-    <w:bookmarkStart w:id="39" w:name="решение-проблем"/>
+    <w:bookmarkStart w:id="35" w:name="горячие-клавиши"/>
     <w:p>
       <w:pPr>
         <w:pStyle w:val="Heading2"/>
       </w:pPr>
       <w:r>
-        <w:t xml:space="preserve">Решение проблем</w:t>
-      </w:r>
-    </w:p>
-    <w:bookmarkStart w:id="35" w:name="устройство-не-определяется"/>
-    <w:p>
-      <w:pPr>
-        <w:pStyle w:val="Heading3"/>
-      </w:pPr>
-      <w:r>
-        <w:t xml:space="preserve">Устройство не определяется</w:t>
+        <w:t xml:space="preserve">Горячие клавиши</w:t>
+      </w:r>
+    </w:p>
+    <w:p>
+      <w:pPr>
+        <w:pStyle w:val="FirstParagraph"/>
+      </w:pPr>
+      <w:r>
+        <w:t xml:space="preserve">Для быстрого управления программой доступны следующие горячие клавиши:</w:t>
       </w:r>
     </w:p>
     <w:p>
@@ -2450,214 +2449,346 @@
           <w:numId w:val="1022"/>
         </w:numPr>
       </w:pPr>
-      <w:r>
-        <w:t xml:space="preserve">Проверьте, что установлен NI-VISA</w:t>
-      </w:r>
-    </w:p>
-    <w:p>
-      <w:pPr>
-        <w:pStyle w:val="Compact"/>
-        <w:numPr>
-          <w:ilvl w:val="0"/>
-          <w:numId w:val="1022"/>
-        </w:numPr>
-      </w:pPr>
-      <w:r>
-        <w:t xml:space="preserve">Перезагрузите компьютер после установки драйвера</w:t>
-      </w:r>
-    </w:p>
-    <w:p>
-      <w:pPr>
-        <w:pStyle w:val="Compact"/>
-        <w:numPr>
-          <w:ilvl w:val="0"/>
-          <w:numId w:val="1022"/>
-        </w:numPr>
-      </w:pPr>
-      <w:r>
-        <w:t xml:space="preserve">Попробуйте другой USB-кабель</w:t>
-      </w:r>
-    </w:p>
-    <w:p>
-      <w:pPr>
-        <w:pStyle w:val="Compact"/>
-        <w:numPr>
-          <w:ilvl w:val="0"/>
-          <w:numId w:val="1022"/>
-        </w:numPr>
-      </w:pPr>
-      <w:r>
-        <w:t xml:space="preserve">Проверьте Диспетчер устройств</w:t>
-      </w:r>
-    </w:p>
-    <w:bookmarkEnd w:id="35"/>
-    <w:bookmarkStart w:id="36" w:name="ошибка-при-загрузке-конфигурации"/>
-    <w:p>
-      <w:pPr>
-        <w:pStyle w:val="Heading3"/>
-      </w:pPr>
-      <w:r>
-        <w:t xml:space="preserve">Ошибка при загрузке конфигурации</w:t>
-      </w:r>
-    </w:p>
-    <w:p>
-      <w:pPr>
-        <w:pStyle w:val="Compact"/>
-        <w:numPr>
-          <w:ilvl w:val="0"/>
-          <w:numId w:val="1023"/>
-        </w:numPr>
-      </w:pPr>
-      <w:r>
-        <w:t xml:space="preserve">Проверьте формат CSV-файла</w:t>
-      </w:r>
-    </w:p>
-    <w:p>
-      <w:pPr>
-        <w:pStyle w:val="Compact"/>
-        <w:numPr>
-          <w:ilvl w:val="0"/>
-          <w:numId w:val="1023"/>
-        </w:numPr>
-      </w:pPr>
-      <w:r>
-        <w:t xml:space="preserve">Убедитесь, что кодировка UTF-8</w:t>
-      </w:r>
-    </w:p>
-    <w:p>
-      <w:pPr>
-        <w:pStyle w:val="Compact"/>
-        <w:numPr>
-          <w:ilvl w:val="0"/>
-          <w:numId w:val="1023"/>
-        </w:numPr>
-      </w:pPr>
-      <w:r>
-        <w:t xml:space="preserve">Проверьте правильность типов измерений и диапазонов</w:t>
-      </w:r>
-    </w:p>
-    <w:p>
-      <w:pPr>
-        <w:pStyle w:val="Compact"/>
-        <w:numPr>
-          <w:ilvl w:val="0"/>
-          <w:numId w:val="1023"/>
-        </w:numPr>
-      </w:pPr>
-      <w:r>
-        <w:t xml:space="preserve">Смотрите подробную ошибку в окне логов</w:t>
-      </w:r>
-    </w:p>
-    <w:bookmarkEnd w:id="36"/>
-    <w:bookmarkStart w:id="37" w:name="нет-данных-при-сканировании"/>
-    <w:p>
-      <w:pPr>
-        <w:pStyle w:val="Heading3"/>
-      </w:pPr>
-      <w:r>
-        <w:t xml:space="preserve">Нет данных при сканировании</w:t>
-      </w:r>
-    </w:p>
-    <w:p>
-      <w:pPr>
-        <w:pStyle w:val="Compact"/>
-        <w:numPr>
-          <w:ilvl w:val="0"/>
-          <w:numId w:val="1024"/>
-        </w:numPr>
-      </w:pPr>
-      <w:r>
-        <w:t xml:space="preserve">Убедитесь, что мультиметр подключён</w:t>
-      </w:r>
-    </w:p>
-    <w:p>
-      <w:pPr>
-        <w:pStyle w:val="Compact"/>
-        <w:numPr>
-          <w:ilvl w:val="0"/>
-          <w:numId w:val="1024"/>
-        </w:numPr>
-      </w:pPr>
-      <w:r>
-        <w:t xml:space="preserve">Проверьте, что загружена конфигурация каналов</w:t>
-      </w:r>
-    </w:p>
-    <w:p>
-      <w:pPr>
-        <w:pStyle w:val="Compact"/>
-        <w:numPr>
-          <w:ilvl w:val="0"/>
-          <w:numId w:val="1024"/>
-        </w:numPr>
-      </w:pPr>
-      <w:r>
-        <w:t xml:space="preserve">Проверьте подключение измерительных проводов</w:t>
-      </w:r>
-    </w:p>
-    <w:bookmarkEnd w:id="37"/>
-    <w:bookmarkStart w:id="38" w:name="excel-не-открывается"/>
-    <w:p>
-      <w:pPr>
-        <w:pStyle w:val="Heading3"/>
-      </w:pPr>
-      <w:r>
-        <w:t xml:space="preserve">Excel не открывается</w:t>
-      </w:r>
-    </w:p>
-    <w:p>
-      <w:pPr>
-        <w:pStyle w:val="Compact"/>
-        <w:numPr>
-          <w:ilvl w:val="0"/>
-          <w:numId w:val="1025"/>
-        </w:numPr>
-      </w:pPr>
-      <w:r>
-        <w:t xml:space="preserve">Убедитесь, что установлен Microsoft Excel</w:t>
-      </w:r>
-    </w:p>
-    <w:p>
-      <w:pPr>
-        <w:pStyle w:val="Compact"/>
-        <w:numPr>
-          <w:ilvl w:val="0"/>
-          <w:numId w:val="1025"/>
-        </w:numPr>
-      </w:pPr>
-      <w:r>
-        <w:t xml:space="preserve">Проверьте, что файл не открыт в другой программе</w:t>
-      </w:r>
-    </w:p>
-    <w:bookmarkEnd w:id="38"/>
-    <w:bookmarkEnd w:id="39"/>
-    <w:bookmarkStart w:id="40" w:name="дополнительная-информация"/>
-    <w:p>
-      <w:pPr>
-        <w:pStyle w:val="Heading2"/>
-      </w:pPr>
-      <w:r>
-        <w:t xml:space="preserve">Дополнительная информация</w:t>
-      </w:r>
-    </w:p>
-    <w:p>
-      <w:pPr>
-        <w:pStyle w:val="Compact"/>
-        <w:numPr>
-          <w:ilvl w:val="0"/>
-          <w:numId w:val="1026"/>
-        </w:numPr>
-      </w:pPr>
-      <w:r>
-        <w:t xml:space="preserve">Поддерживается только</w:t>
-      </w:r>
-      <w:r>
-        <w:t xml:space="preserve"> </w:t>
-      </w:r>
       <w:r>
         <w:rPr>
           <w:b/>
           <w:bCs/>
         </w:rPr>
+        <w:t xml:space="preserve">Enter</w:t>
+      </w:r>
+      <w:r>
+        <w:t xml:space="preserve"> </w:t>
+      </w:r>
+      <w:r>
+        <w:t xml:space="preserve">— запуск однократного сканирования (Single Scan)</w:t>
+      </w:r>
+    </w:p>
+    <w:p>
+      <w:pPr>
+        <w:pStyle w:val="Compact"/>
+        <w:numPr>
+          <w:ilvl w:val="1"/>
+          <w:numId w:val="1023"/>
+        </w:numPr>
+      </w:pPr>
+      <w:r>
+        <w:t xml:space="preserve">Работает только при подключённом устройстве</w:t>
+      </w:r>
+    </w:p>
+    <w:p>
+      <w:pPr>
+        <w:pStyle w:val="Compact"/>
+        <w:numPr>
+          <w:ilvl w:val="1"/>
+          <w:numId w:val="1023"/>
+        </w:numPr>
+      </w:pPr>
+      <w:r>
+        <w:t xml:space="preserve">Аналог нажатия кнопки</w:t>
+      </w:r>
+      <w:r>
+        <w:t xml:space="preserve"> </w:t>
+      </w:r>
+      <w:r>
+        <w:rPr>
+          <w:rStyle w:val="VerbatimChar"/>
+        </w:rPr>
+        <w:t xml:space="preserve">Single Scan</w:t>
+      </w:r>
+    </w:p>
+    <w:p>
+      <w:pPr>
+        <w:pStyle w:val="Compact"/>
+        <w:numPr>
+          <w:ilvl w:val="0"/>
+          <w:numId w:val="1022"/>
+        </w:numPr>
+      </w:pPr>
+      <w:r>
+        <w:rPr>
+          <w:b/>
+          <w:bCs/>
+        </w:rPr>
+        <w:t xml:space="preserve">Escape</w:t>
+      </w:r>
+      <w:r>
+        <w:t xml:space="preserve"> </w:t>
+      </w:r>
+      <w:r>
+        <w:t xml:space="preserve">— очистка поля серийного номера и установка фокуса</w:t>
+      </w:r>
+    </w:p>
+    <w:p>
+      <w:pPr>
+        <w:pStyle w:val="Compact"/>
+        <w:numPr>
+          <w:ilvl w:val="1"/>
+          <w:numId w:val="1024"/>
+        </w:numPr>
+      </w:pPr>
+      <w:r>
+        <w:t xml:space="preserve">Очищает содержимое поля ввода серийного номера</w:t>
+      </w:r>
+    </w:p>
+    <w:p>
+      <w:pPr>
+        <w:pStyle w:val="Compact"/>
+        <w:numPr>
+          <w:ilvl w:val="1"/>
+          <w:numId w:val="1024"/>
+        </w:numPr>
+      </w:pPr>
+      <w:r>
+        <w:t xml:space="preserve">Устанавливает фокус курсора в это поле</w:t>
+      </w:r>
+    </w:p>
+    <w:p>
+      <w:pPr>
+        <w:pStyle w:val="Compact"/>
+        <w:numPr>
+          <w:ilvl w:val="1"/>
+          <w:numId w:val="1024"/>
+        </w:numPr>
+      </w:pPr>
+      <w:r>
+        <w:t xml:space="preserve">Удобно для быстрого ввода нового серийного номера</w:t>
+      </w:r>
+    </w:p>
+    <w:bookmarkEnd w:id="35"/>
+    <w:bookmarkStart w:id="40" w:name="решение-проблем"/>
+    <w:p>
+      <w:pPr>
+        <w:pStyle w:val="Heading2"/>
+      </w:pPr>
+      <w:r>
+        <w:t xml:space="preserve">Решение проблем</w:t>
+      </w:r>
+    </w:p>
+    <w:bookmarkStart w:id="36" w:name="устройство-не-определяется"/>
+    <w:p>
+      <w:pPr>
+        <w:pStyle w:val="Heading3"/>
+      </w:pPr>
+      <w:r>
+        <w:t xml:space="preserve">Устройство не определяется</w:t>
+      </w:r>
+    </w:p>
+    <w:p>
+      <w:pPr>
+        <w:pStyle w:val="Compact"/>
+        <w:numPr>
+          <w:ilvl w:val="0"/>
+          <w:numId w:val="1025"/>
+        </w:numPr>
+      </w:pPr>
+      <w:r>
+        <w:t xml:space="preserve">Проверьте, что установлен NI-VISA</w:t>
+      </w:r>
+    </w:p>
+    <w:p>
+      <w:pPr>
+        <w:pStyle w:val="Compact"/>
+        <w:numPr>
+          <w:ilvl w:val="0"/>
+          <w:numId w:val="1025"/>
+        </w:numPr>
+      </w:pPr>
+      <w:r>
+        <w:t xml:space="preserve">Перезагрузите компьютер после установки драйвера</w:t>
+      </w:r>
+    </w:p>
+    <w:p>
+      <w:pPr>
+        <w:pStyle w:val="Compact"/>
+        <w:numPr>
+          <w:ilvl w:val="0"/>
+          <w:numId w:val="1025"/>
+        </w:numPr>
+      </w:pPr>
+      <w:r>
+        <w:t xml:space="preserve">Попробуйте другой USB-кабель</w:t>
+      </w:r>
+    </w:p>
+    <w:p>
+      <w:pPr>
+        <w:pStyle w:val="Compact"/>
+        <w:numPr>
+          <w:ilvl w:val="0"/>
+          <w:numId w:val="1025"/>
+        </w:numPr>
+      </w:pPr>
+      <w:r>
+        <w:t xml:space="preserve">Проверьте Диспетчер устройств</w:t>
+      </w:r>
+    </w:p>
+    <w:bookmarkEnd w:id="36"/>
+    <w:bookmarkStart w:id="37" w:name="ошибка-при-загрузке-конфигурации"/>
+    <w:p>
+      <w:pPr>
+        <w:pStyle w:val="Heading3"/>
+      </w:pPr>
+      <w:r>
+        <w:t xml:space="preserve">Ошибка при загрузке конфигурации</w:t>
+      </w:r>
+    </w:p>
+    <w:p>
+      <w:pPr>
+        <w:pStyle w:val="Compact"/>
+        <w:numPr>
+          <w:ilvl w:val="0"/>
+          <w:numId w:val="1026"/>
+        </w:numPr>
+      </w:pPr>
+      <w:r>
+        <w:t xml:space="preserve">Проверьте формат CSV-файла</w:t>
+      </w:r>
+    </w:p>
+    <w:p>
+      <w:pPr>
+        <w:pStyle w:val="Compact"/>
+        <w:numPr>
+          <w:ilvl w:val="0"/>
+          <w:numId w:val="1026"/>
+        </w:numPr>
+      </w:pPr>
+      <w:r>
+        <w:t xml:space="preserve">Убедитесь, что кодировка UTF-8</w:t>
+      </w:r>
+    </w:p>
+    <w:p>
+      <w:pPr>
+        <w:pStyle w:val="Compact"/>
+        <w:numPr>
+          <w:ilvl w:val="0"/>
+          <w:numId w:val="1026"/>
+        </w:numPr>
+      </w:pPr>
+      <w:r>
+        <w:t xml:space="preserve">Проверьте правильность типов измерений и диапазонов</w:t>
+      </w:r>
+    </w:p>
+    <w:p>
+      <w:pPr>
+        <w:pStyle w:val="Compact"/>
+        <w:numPr>
+          <w:ilvl w:val="0"/>
+          <w:numId w:val="1026"/>
+        </w:numPr>
+      </w:pPr>
+      <w:r>
+        <w:t xml:space="preserve">Смотрите подробную ошибку в окне логов</w:t>
+      </w:r>
+    </w:p>
+    <w:bookmarkEnd w:id="37"/>
+    <w:bookmarkStart w:id="38" w:name="нет-данных-при-сканировании"/>
+    <w:p>
+      <w:pPr>
+        <w:pStyle w:val="Heading3"/>
+      </w:pPr>
+      <w:r>
+        <w:t xml:space="preserve">Нет данных при сканировании</w:t>
+      </w:r>
+    </w:p>
+    <w:p>
+      <w:pPr>
+        <w:pStyle w:val="Compact"/>
+        <w:numPr>
+          <w:ilvl w:val="0"/>
+          <w:numId w:val="1027"/>
+        </w:numPr>
+      </w:pPr>
+      <w:r>
+        <w:t xml:space="preserve">Убедитесь, что мультиметр подключён</w:t>
+      </w:r>
+    </w:p>
+    <w:p>
+      <w:pPr>
+        <w:pStyle w:val="Compact"/>
+        <w:numPr>
+          <w:ilvl w:val="0"/>
+          <w:numId w:val="1027"/>
+        </w:numPr>
+      </w:pPr>
+      <w:r>
+        <w:t xml:space="preserve">Проверьте, что загружена конфигурация каналов</w:t>
+      </w:r>
+    </w:p>
+    <w:p>
+      <w:pPr>
+        <w:pStyle w:val="Compact"/>
+        <w:numPr>
+          <w:ilvl w:val="0"/>
+          <w:numId w:val="1027"/>
+        </w:numPr>
+      </w:pPr>
+      <w:r>
+        <w:t xml:space="preserve">Проверьте подключение измерительных проводов</w:t>
+      </w:r>
+    </w:p>
+    <w:bookmarkEnd w:id="38"/>
+    <w:bookmarkStart w:id="39" w:name="excel-не-открывается"/>
+    <w:p>
+      <w:pPr>
+        <w:pStyle w:val="Heading3"/>
+      </w:pPr>
+      <w:r>
+        <w:t xml:space="preserve">Excel не открывается</w:t>
+      </w:r>
+    </w:p>
+    <w:p>
+      <w:pPr>
+        <w:pStyle w:val="Compact"/>
+        <w:numPr>
+          <w:ilvl w:val="0"/>
+          <w:numId w:val="1028"/>
+        </w:numPr>
+      </w:pPr>
+      <w:r>
+        <w:t xml:space="preserve">Убедитесь, что установлен Microsoft Excel</w:t>
+      </w:r>
+    </w:p>
+    <w:p>
+      <w:pPr>
+        <w:pStyle w:val="Compact"/>
+        <w:numPr>
+          <w:ilvl w:val="0"/>
+          <w:numId w:val="1028"/>
+        </w:numPr>
+      </w:pPr>
+      <w:r>
+        <w:t xml:space="preserve">Проверьте, что файл не открыт в другой программе</w:t>
+      </w:r>
+    </w:p>
+    <w:bookmarkEnd w:id="39"/>
+    <w:bookmarkEnd w:id="40"/>
+    <w:bookmarkStart w:id="41" w:name="дополнительная-информация"/>
+    <w:p>
+      <w:pPr>
+        <w:pStyle w:val="Heading2"/>
+      </w:pPr>
+      <w:r>
+        <w:t xml:space="preserve">Дополнительная информация</w:t>
+      </w:r>
+    </w:p>
+    <w:p>
+      <w:pPr>
+        <w:pStyle w:val="Compact"/>
+        <w:numPr>
+          <w:ilvl w:val="0"/>
+          <w:numId w:val="1029"/>
+        </w:numPr>
+      </w:pPr>
+      <w:r>
+        <w:t xml:space="preserve">Поддерживается только</w:t>
+      </w:r>
+      <w:r>
+        <w:t xml:space="preserve"> </w:t>
+      </w:r>
+      <w:r>
+        <w:rPr>
+          <w:b/>
+          <w:bCs/>
+        </w:rPr>
         <w:t xml:space="preserve">USB-подключение</w:t>
       </w:r>
     </w:p>
@@ -2666,7 +2797,7 @@
         <w:pStyle w:val="Compact"/>
         <w:numPr>
           <w:ilvl w:val="0"/>
-          <w:numId w:val="1026"/>
+          <w:numId w:val="1029"/>
         </w:numPr>
       </w:pPr>
       <w:r>
@@ -2678,7 +2809,7 @@
         <w:pStyle w:val="Compact"/>
         <w:numPr>
           <w:ilvl w:val="0"/>
-          <w:numId w:val="1026"/>
+          <w:numId w:val="1029"/>
         </w:numPr>
       </w:pPr>
       <w:r>
@@ -2690,7 +2821,7 @@
         <w:pStyle w:val="Compact"/>
         <w:numPr>
           <w:ilvl w:val="0"/>
-          <w:numId w:val="1026"/>
+          <w:numId w:val="1029"/>
         </w:numPr>
       </w:pPr>
       <w:r>
@@ -2716,7 +2847,7 @@
         <w:t xml:space="preserve">Версия программы</w:t>
       </w:r>
       <w:r>
-        <w:t xml:space="preserve">: 1.7.3rc</w:t>
+        <w:t xml:space="preserve">: 1.7.4rc</w:t>
       </w:r>
       <w:r>
         <w:br/>
@@ -2732,8 +2863,8 @@
         <w:t xml:space="preserve">: 03.02.2026</w:t>
       </w:r>
     </w:p>
-    <w:bookmarkEnd w:id="40"/>
     <w:bookmarkEnd w:id="41"/>
+    <w:bookmarkEnd w:id="42"/>
     <w:sectPr>
       <w:footnotePr>
         <w:numRestart w:val="eachSect"/>
@@ -3315,94 +3446,13 @@
     </w:lvlOverride>
   </w:num>
   <w:num w:numId="1022">
-    <w:abstractNumId w:val="99411"/>
-    <w:lvlOverride w:ilvl="0">
-      <w:startOverride w:val="1"/>
-    </w:lvlOverride>
-    <w:lvlOverride w:ilvl="1">
-      <w:startOverride w:val="1"/>
-    </w:lvlOverride>
-    <w:lvlOverride w:ilvl="2">
-      <w:startOverride w:val="1"/>
-    </w:lvlOverride>
-    <w:lvlOverride w:ilvl="3">
-      <w:startOverride w:val="1"/>
-    </w:lvlOverride>
-    <w:lvlOverride w:ilvl="4">
-      <w:startOverride w:val="1"/>
-    </w:lvlOverride>
-    <w:lvlOverride w:ilvl="5">
-      <w:startOverride w:val="1"/>
-    </w:lvlOverride>
-    <w:lvlOverride w:ilvl="6">
-      <w:startOverride w:val="1"/>
-    </w:lvlOverride>
-    <w:lvlOverride w:ilvl="7">
-      <w:startOverride w:val="1"/>
-    </w:lvlOverride>
-    <w:lvlOverride w:ilvl="8">
-      <w:startOverride w:val="1"/>
-    </w:lvlOverride>
+    <w:abstractNumId w:val="991"/>
   </w:num>
   <w:num w:numId="1023">
-    <w:abstractNumId w:val="99411"/>
-    <w:lvlOverride w:ilvl="0">
-      <w:startOverride w:val="1"/>
-    </w:lvlOverride>
-    <w:lvlOverride w:ilvl="1">
-      <w:startOverride w:val="1"/>
-    </w:lvlOverride>
-    <w:lvlOverride w:ilvl="2">
-      <w:startOverride w:val="1"/>
-    </w:lvlOverride>
-    <w:lvlOverride w:ilvl="3">
-      <w:startOverride w:val="1"/>
-    </w:lvlOverride>
-    <w:lvlOverride w:ilvl="4">
-      <w:startOverride w:val="1"/>
-    </w:lvlOverride>
-    <w:lvlOverride w:ilvl="5">
-      <w:startOverride w:val="1"/>
-    </w:lvlOverride>
-    <w:lvlOverride w:ilvl="6">
-      <w:startOverride w:val="1"/>
-    </w:lvlOverride>
-    <w:lvlOverride w:ilvl="7">
-      <w:startOverride w:val="1"/>
-    </w:lvlOverride>
-    <w:lvlOverride w:ilvl="8">
-      <w:startOverride w:val="1"/>
-    </w:lvlOverride>
+    <w:abstractNumId w:val="991"/>
   </w:num>
   <w:num w:numId="1024">
-    <w:abstractNumId w:val="99411"/>
-    <w:lvlOverride w:ilvl="0">
-      <w:startOverride w:val="1"/>
-    </w:lvlOverride>
-    <w:lvlOverride w:ilvl="1">
-      <w:startOverride w:val="1"/>
-    </w:lvlOverride>
-    <w:lvlOverride w:ilvl="2">
-      <w:startOverride w:val="1"/>
-    </w:lvlOverride>
-    <w:lvlOverride w:ilvl="3">
-      <w:startOverride w:val="1"/>
-    </w:lvlOverride>
-    <w:lvlOverride w:ilvl="4">
-      <w:startOverride w:val="1"/>
-    </w:lvlOverride>
-    <w:lvlOverride w:ilvl="5">
-      <w:startOverride w:val="1"/>
-    </w:lvlOverride>
-    <w:lvlOverride w:ilvl="6">
-      <w:startOverride w:val="1"/>
-    </w:lvlOverride>
-    <w:lvlOverride w:ilvl="7">
-      <w:startOverride w:val="1"/>
-    </w:lvlOverride>
-    <w:lvlOverride w:ilvl="8">
-      <w:startOverride w:val="1"/>
-    </w:lvlOverride>
+    <w:abstractNumId w:val="991"/>
   </w:num>
   <w:num w:numId="1025">
     <w:abstractNumId w:val="99411"/>
@@ -3435,6 +3485,96 @@
     </w:lvlOverride>
   </w:num>
   <w:num w:numId="1026">
+    <w:abstractNumId w:val="99411"/>
+    <w:lvlOverride w:ilvl="0">
+      <w:startOverride w:val="1"/>
+    </w:lvlOverride>
+    <w:lvlOverride w:ilvl="1">
+      <w:startOverride w:val="1"/>
+    </w:lvlOverride>
+    <w:lvlOverride w:ilvl="2">
+      <w:startOverride w:val="1"/>
+    </w:lvlOverride>
+    <w:lvlOverride w:ilvl="3">
+      <w:startOverride w:val="1"/>
+    </w:lvlOverride>
+    <w:lvlOverride w:ilvl="4">
+      <w:startOverride w:val="1"/>
+    </w:lvlOverride>
+    <w:lvlOverride w:ilvl="5">
+      <w:startOverride w:val="1"/>
+    </w:lvlOverride>
+    <w:lvlOverride w:ilvl="6">
+      <w:startOverride w:val="1"/>
+    </w:lvlOverride>
+    <w:lvlOverride w:ilvl="7">
+      <w:startOverride w:val="1"/>
+    </w:lvlOverride>
+    <w:lvlOverride w:ilvl="8">
+      <w:startOverride w:val="1"/>
+    </w:lvlOverride>
+  </w:num>
+  <w:num w:numId="1027">
+    <w:abstractNumId w:val="99411"/>
+    <w:lvlOverride w:ilvl="0">
+      <w:startOverride w:val="1"/>
+    </w:lvlOverride>
+    <w:lvlOverride w:ilvl="1">
+      <w:startOverride w:val="1"/>
+    </w:lvlOverride>
+    <w:lvlOverride w:ilvl="2">
+      <w:startOverride w:val="1"/>
+    </w:lvlOverride>
+    <w:lvlOverride w:ilvl="3">
+      <w:startOverride w:val="1"/>
+    </w:lvlOverride>
+    <w:lvlOverride w:ilvl="4">
+      <w:startOverride w:val="1"/>
+    </w:lvlOverride>
+    <w:lvlOverride w:ilvl="5">
+      <w:startOverride w:val="1"/>
+    </w:lvlOverride>
+    <w:lvlOverride w:ilvl="6">
+      <w:startOverride w:val="1"/>
+    </w:lvlOverride>
+    <w:lvlOverride w:ilvl="7">
+      <w:startOverride w:val="1"/>
+    </w:lvlOverride>
+    <w:lvlOverride w:ilvl="8">
+      <w:startOverride w:val="1"/>
+    </w:lvlOverride>
+  </w:num>
+  <w:num w:numId="1028">
+    <w:abstractNumId w:val="99411"/>
+    <w:lvlOverride w:ilvl="0">
+      <w:startOverride w:val="1"/>
+    </w:lvlOverride>
+    <w:lvlOverride w:ilvl="1">
+      <w:startOverride w:val="1"/>
+    </w:lvlOverride>
+    <w:lvlOverride w:ilvl="2">
+      <w:startOverride w:val="1"/>
+    </w:lvlOverride>
+    <w:lvlOverride w:ilvl="3">
+      <w:startOverride w:val="1"/>
+    </w:lvlOverride>
+    <w:lvlOverride w:ilvl="4">
+      <w:startOverride w:val="1"/>
+    </w:lvlOverride>
+    <w:lvlOverride w:ilvl="5">
+      <w:startOverride w:val="1"/>
+    </w:lvlOverride>
+    <w:lvlOverride w:ilvl="6">
+      <w:startOverride w:val="1"/>
+    </w:lvlOverride>
+    <w:lvlOverride w:ilvl="7">
+      <w:startOverride w:val="1"/>
+    </w:lvlOverride>
+    <w:lvlOverride w:ilvl="8">
+      <w:startOverride w:val="1"/>
+    </w:lvlOverride>
+  </w:num>
+  <w:num w:numId="1029">
     <w:abstractNumId w:val="991"/>
   </w:num>
 </w:numbering>

</xml_diff>